<commit_message>
docs(meridian): add Meridian platform PM plan and update vision doc with platform name
Adds full 24-month PM plan for building Meridian (meridian-pm-plan.md/.docx)
covering Phase 0 foundation, Phase 1 Solimed build, Phase 2 second site,
and Phase 3 market launch. Updates pivot-platform-vision.md/.docx to reflect
the Meridian platform name throughout.
</commit_message>
<xml_diff>
--- a/docs/reports/pivot-platform-vision.docx
+++ b/docs/reports/pivot-platform-vision.docx
@@ -2,22 +2,35 @@
 <file path=word/document.xml><?xml version="1.0" encoding="utf-8"?>
 <w:document xmlns:w="http://schemas.openxmlformats.org/wordprocessingml/2006/main" xmlns:m="http://schemas.openxmlformats.org/officeDocument/2006/math" xmlns:r="http://schemas.openxmlformats.org/officeDocument/2006/relationships" xmlns:o="urn:schemas-microsoft-com:office:office" xmlns:v="urn:schemas-microsoft-com:vml" xmlns:w10="urn:schemas-microsoft-com:office:word" xmlns:a="http://schemas.openxmlformats.org/drawingml/2006/main" xmlns:pic="http://schemas.openxmlformats.org/drawingml/2006/picture" xmlns:wp="http://schemas.openxmlformats.org/drawingml/2006/wordprocessingDrawing">
   <w:body>
-    <w:bookmarkStart w:id="50" w:name="pivot-platform-product-vision"/>
+    <w:bookmarkStart w:id="51" w:name="meridian-product-vision"/>
     <w:p>
       <w:pPr>
         <w:pStyle w:val="Heading1"/>
       </w:pPr>
       <w:r>
-        <w:t xml:space="preserve">Pivot Platform — Product Vision</w:t>
-      </w:r>
-    </w:p>
-    <w:bookmarkStart w:id="9" w:name="Xa603b146b3ef2a6fa5307da547c9bee47e065dd"/>
+        <w:t xml:space="preserve">Meridian — Product Vision</w:t>
+      </w:r>
+    </w:p>
+    <w:bookmarkStart w:id="10" w:name="Xa603b146b3ef2a6fa5307da547c9bee47e065dd"/>
     <w:p>
       <w:pPr>
         <w:pStyle w:val="Heading2"/>
       </w:pPr>
       <w:r>
         <w:t xml:space="preserve">Unified Clinical Trial Intelligence Platform</w:t>
+      </w:r>
+    </w:p>
+    <w:bookmarkStart w:id="9" w:name="by-pivot"/>
+    <w:p>
+      <w:pPr>
+        <w:pStyle w:val="Heading3"/>
+      </w:pPr>
+      <w:r>
+        <w:rPr>
+          <w:i/>
+          <w:iCs/>
+        </w:rPr>
+        <w:t xml:space="preserve">by Pivot</w:t>
       </w:r>
     </w:p>
     <w:p>
@@ -93,23 +106,31 @@
           <w:b/>
           <w:bCs/>
         </w:rPr>
-        <w:t xml:space="preserve">Codename:</w:t>
-      </w:r>
-      <w:r>
-        <w:t xml:space="preserve"> </w:t>
-      </w:r>
-      <w:r>
-        <w:t xml:space="preserve">TBD</w:t>
-      </w:r>
-      <w:r>
-        <w:t xml:space="preserve"> </w:t>
-      </w:r>
-      <w:r>
-        <w:rPr>
-          <w:i/>
-          <w:iCs/>
-        </w:rPr>
-        <w:t xml:space="preserve">(suggested names at end of document)</w:t>
+        <w:t xml:space="preserve">Platform Name:</w:t>
+      </w:r>
+      <w:r>
+        <w:t xml:space="preserve"> </w:t>
+      </w:r>
+      <w:r>
+        <w:t xml:space="preserve">Meridian</w:t>
+      </w:r>
+    </w:p>
+    <w:p>
+      <w:pPr>
+        <w:pStyle w:val="BlockText"/>
+      </w:pPr>
+      <w:r>
+        <w:rPr>
+          <w:b/>
+          <w:bCs/>
+        </w:rPr>
+        <w:t xml:space="preserve">Why Meridian:</w:t>
+      </w:r>
+      <w:r>
+        <w:t xml:space="preserve"> </w:t>
+      </w:r>
+      <w:r>
+        <w:t xml:space="preserve">A meridian is the reference line from which all position is measured — the point of precision that tells you exactly where you are. Meridian does the same for clinical trials: it tells you exactly where every patient is in their journey, where every dollar is in its lifecycle, and where your next best candidate is hiding in your data. Navigation. Precision. Clarity.</w:t>
       </w:r>
     </w:p>
     <w:p>
@@ -120,7 +141,8 @@
       </w:r>
     </w:p>
     <w:bookmarkEnd w:id="9"/>
-    <w:bookmarkStart w:id="10" w:name="the-vision-in-one-sentence"/>
+    <w:bookmarkEnd w:id="10"/>
+    <w:bookmarkStart w:id="11" w:name="the-vision-in-one-sentence"/>
     <w:p>
       <w:pPr>
         <w:pStyle w:val="Heading2"/>
@@ -144,8 +166,8 @@
         </w:pict>
       </w:r>
     </w:p>
-    <w:bookmarkEnd w:id="10"/>
-    <w:bookmarkStart w:id="11" w:name="the-problem-we-are-solving"/>
+    <w:bookmarkEnd w:id="11"/>
+    <w:bookmarkStart w:id="12" w:name="the-problem-we-are-solving"/>
     <w:p>
       <w:pPr>
         <w:pStyle w:val="Heading2"/>
@@ -474,8 +496,8 @@
         </w:pict>
       </w:r>
     </w:p>
-    <w:bookmarkEnd w:id="11"/>
-    <w:bookmarkStart w:id="12" w:name="target-customer"/>
+    <w:bookmarkEnd w:id="12"/>
+    <w:bookmarkStart w:id="13" w:name="target-customer"/>
     <w:p>
       <w:pPr>
         <w:pStyle w:val="Heading2"/>
@@ -545,8 +567,8 @@
         </w:pict>
       </w:r>
     </w:p>
-    <w:bookmarkEnd w:id="12"/>
-    <w:bookmarkStart w:id="13" w:name="platform-architecture-the-five-layers"/>
+    <w:bookmarkEnd w:id="13"/>
+    <w:bookmarkStart w:id="14" w:name="platform-architecture-the-five-layers"/>
     <w:p>
       <w:pPr>
         <w:pStyle w:val="Heading2"/>
@@ -753,8 +775,8 @@
         </w:pict>
       </w:r>
     </w:p>
-    <w:bookmarkEnd w:id="13"/>
-    <w:bookmarkStart w:id="16" w:name="layer-1-data-ingestion-hub"/>
+    <w:bookmarkEnd w:id="14"/>
+    <w:bookmarkStart w:id="17" w:name="layer-1-data-ingestion-hub"/>
     <w:p>
       <w:pPr>
         <w:pStyle w:val="Heading2"/>
@@ -799,7 +821,7 @@
         <w:t xml:space="preserve">Today, sites have patient data scattered across EHRs, EDC systems, paper forms, lab portals, and spreadsheets. No single view exists. Finding candidates for a study means manual chart review — slow, expensive, and incomplete.</w:t>
       </w:r>
     </w:p>
-    <w:bookmarkStart w:id="14" w:name="data-sources-supported"/>
+    <w:bookmarkStart w:id="15" w:name="data-sources-supported"/>
     <w:p>
       <w:pPr>
         <w:pStyle w:val="Heading3"/>
@@ -1210,8 +1232,8 @@
         </w:tc>
       </w:tr>
     </w:tbl>
-    <w:bookmarkEnd w:id="14"/>
-    <w:bookmarkStart w:id="15" w:name="what-gets-created"/>
+    <w:bookmarkEnd w:id="15"/>
+    <w:bookmarkStart w:id="16" w:name="what-gets-created"/>
     <w:p>
       <w:pPr>
         <w:pStyle w:val="Heading3"/>
@@ -1302,9 +1324,9 @@
         </w:pict>
       </w:r>
     </w:p>
-    <w:bookmarkEnd w:id="15"/>
     <w:bookmarkEnd w:id="16"/>
-    <w:bookmarkStart w:id="18" w:name="layer-2-payment-engine"/>
+    <w:bookmarkEnd w:id="17"/>
+    <w:bookmarkStart w:id="19" w:name="layer-2-payment-engine"/>
     <w:p>
       <w:pPr>
         <w:pStyle w:val="Heading2"/>
@@ -1349,7 +1371,7 @@
         <w:t xml:space="preserve">At Solimed and every site we’ve studied, billing is manual. Finance exports reports, creates invoices, emails CROs, and manually marks things paid. Revenue leaks because visits are missed in billing runs. Cash flow is invisible. Investigators get paid months after earning fees because nobody automated the reconciliation.</w:t>
       </w:r>
     </w:p>
-    <w:bookmarkStart w:id="17" w:name="payment-engine-capabilities"/>
+    <w:bookmarkStart w:id="18" w:name="payment-engine-capabilities"/>
     <w:p>
       <w:pPr>
         <w:pStyle w:val="Heading3"/>
@@ -1545,9 +1567,9 @@
         </w:pict>
       </w:r>
     </w:p>
-    <w:bookmarkEnd w:id="17"/>
     <w:bookmarkEnd w:id="18"/>
-    <w:bookmarkStart w:id="24" w:name="layer-3-clinical-operations"/>
+    <w:bookmarkEnd w:id="19"/>
+    <w:bookmarkStart w:id="25" w:name="layer-3-clinical-operations"/>
     <w:p>
       <w:pPr>
         <w:pStyle w:val="Heading2"/>
@@ -1586,7 +1608,7 @@
         <w:t xml:space="preserve">Manages the full clinical trial workflow for coordinators and investigators — from study setup through visit completion and regulatory closeout.</w:t>
       </w:r>
     </w:p>
-    <w:bookmarkStart w:id="19" w:name="study-protocol-management"/>
+    <w:bookmarkStart w:id="20" w:name="study-protocol-management"/>
     <w:p>
       <w:pPr>
         <w:pStyle w:val="Heading3"/>
@@ -1667,8 +1689,8 @@
         <w:t xml:space="preserve">Site replication: create a new site study from an existing one with configurable overrides per site</w:t>
       </w:r>
     </w:p>
-    <w:bookmarkEnd w:id="19"/>
-    <w:bookmarkStart w:id="20" w:name="visit-workflow"/>
+    <w:bookmarkEnd w:id="20"/>
+    <w:bookmarkStart w:id="21" w:name="visit-workflow"/>
     <w:p>
       <w:pPr>
         <w:pStyle w:val="Heading3"/>
@@ -1773,8 +1795,8 @@
         <w:t xml:space="preserve">Stop Report: when a study is stopped, auto-generates list of all open visits at time of halt</w:t>
       </w:r>
     </w:p>
-    <w:bookmarkEnd w:id="20"/>
-    <w:bookmarkStart w:id="21" w:name="esource-electronic-source-documentation"/>
+    <w:bookmarkEnd w:id="21"/>
+    <w:bookmarkStart w:id="22" w:name="esource-electronic-source-documentation"/>
     <w:p>
       <w:pPr>
         <w:pStyle w:val="Heading3"/>
@@ -1843,8 +1865,8 @@
         <w:t xml:space="preserve">Note: Solimed currently uses paper source docs by CRO advisory. eSource is offered as an optional module — sites that want to stay on paper can. Sites ready to go digital have a path.</w:t>
       </w:r>
     </w:p>
-    <w:bookmarkEnd w:id="21"/>
-    <w:bookmarkStart w:id="22" w:name="econsent"/>
+    <w:bookmarkEnd w:id="22"/>
+    <w:bookmarkStart w:id="23" w:name="econsent"/>
     <w:p>
       <w:pPr>
         <w:pStyle w:val="Heading3"/>
@@ -1913,8 +1935,8 @@
         <w:t xml:space="preserve">21 CFR Part 11 / GDPR compliant</w:t>
       </w:r>
     </w:p>
-    <w:bookmarkEnd w:id="22"/>
-    <w:bookmarkStart w:id="23" w:name="regulatory-binder"/>
+    <w:bookmarkEnd w:id="23"/>
+    <w:bookmarkStart w:id="24" w:name="regulatory-binder"/>
     <w:p>
       <w:pPr>
         <w:pStyle w:val="Heading3"/>
@@ -1978,9 +2000,9 @@
         </w:pict>
       </w:r>
     </w:p>
-    <w:bookmarkEnd w:id="23"/>
     <w:bookmarkEnd w:id="24"/>
-    <w:bookmarkStart w:id="28" w:name="layer-4-communication-hub"/>
+    <w:bookmarkEnd w:id="25"/>
+    <w:bookmarkStart w:id="29" w:name="layer-4-communication-hub"/>
     <w:p>
       <w:pPr>
         <w:pStyle w:val="Heading2"/>
@@ -2037,7 +2059,7 @@
         <w:t xml:space="preserve">Every call, text, and email is linked to a specific patient record, visit, and study. The AI knows the context. It knows the protocol. It knows whether the patient has missed visits. It knows their sentiment trend over the last 3 calls.</w:t>
       </w:r>
     </w:p>
-    <w:bookmarkStart w:id="25" w:name="ai-powered-patient-communications"/>
+    <w:bookmarkStart w:id="26" w:name="ai-powered-patient-communications"/>
     <w:p>
       <w:pPr>
         <w:pStyle w:val="Heading3"/>
@@ -2241,8 +2263,8 @@
         <w:t xml:space="preserve">- Inbound email threaded per patient</w:t>
       </w:r>
     </w:p>
-    <w:bookmarkEnd w:id="25"/>
-    <w:bookmarkStart w:id="26" w:name="sentiment-intelligence"/>
+    <w:bookmarkEnd w:id="26"/>
+    <w:bookmarkStart w:id="27" w:name="sentiment-intelligence"/>
     <w:p>
       <w:pPr>
         <w:pStyle w:val="Heading3"/>
@@ -2299,8 +2321,8 @@
         <w:t xml:space="preserve">Coordinator performance: which coordinators have the highest patient satisfaction scores?</w:t>
       </w:r>
     </w:p>
-    <w:bookmarkEnd w:id="26"/>
-    <w:bookmarkStart w:id="27" w:name="cro-sponsor-communications"/>
+    <w:bookmarkEnd w:id="27"/>
+    <w:bookmarkStart w:id="28" w:name="cro-sponsor-communications"/>
     <w:p>
       <w:pPr>
         <w:pStyle w:val="Heading3"/>
@@ -2364,9 +2386,9 @@
         </w:pict>
       </w:r>
     </w:p>
-    <w:bookmarkEnd w:id="27"/>
     <w:bookmarkEnd w:id="28"/>
-    <w:bookmarkStart w:id="34" w:name="layer-5-ai-intelligence"/>
+    <w:bookmarkEnd w:id="29"/>
+    <w:bookmarkStart w:id="35" w:name="layer-5-ai-intelligence"/>
     <w:p>
       <w:pPr>
         <w:pStyle w:val="Heading2"/>
@@ -2405,7 +2427,7 @@
         <w:t xml:space="preserve">Applies machine learning across all data in the platform — patient profiles, visit histories, communication sentiment, payment patterns — to surface predictions that help sites make better decisions before things go wrong.</w:t>
       </w:r>
     </w:p>
-    <w:bookmarkStart w:id="29" w:name="patient-qualification-engine"/>
+    <w:bookmarkStart w:id="30" w:name="patient-qualification-engine"/>
     <w:p>
       <w:pPr>
         <w:pStyle w:val="Heading3"/>
@@ -2559,8 +2581,8 @@
         <w:t xml:space="preserve">Coordinator sees a prioritized list — start with the patients most likely to qualify AND complete, not just those who appear eligible on paper.</w:t>
       </w:r>
     </w:p>
-    <w:bookmarkEnd w:id="29"/>
-    <w:bookmarkStart w:id="30" w:name="screening-dropout-risk-prediction"/>
+    <w:bookmarkEnd w:id="30"/>
+    <w:bookmarkStart w:id="31" w:name="screening-dropout-risk-prediction"/>
     <w:p>
       <w:pPr>
         <w:pStyle w:val="Heading3"/>
@@ -2653,8 +2675,8 @@
         <w:t xml:space="preserve">— gives coordinator time to act</w:t>
       </w:r>
     </w:p>
-    <w:bookmarkEnd w:id="30"/>
-    <w:bookmarkStart w:id="31" w:name="study-revenue-prediction"/>
+    <w:bookmarkEnd w:id="31"/>
+    <w:bookmarkStart w:id="32" w:name="study-revenue-prediction"/>
     <w:p>
       <w:pPr>
         <w:pStyle w:val="Heading3"/>
@@ -2766,8 +2788,8 @@
         <w:t xml:space="preserve">: based on CRO payment terms and historical payment behavior, predicts when invoiced revenue will convert to cash</w:t>
       </w:r>
     </w:p>
-    <w:bookmarkEnd w:id="31"/>
-    <w:bookmarkStart w:id="32" w:name="protocol-deviation-detection"/>
+    <w:bookmarkEnd w:id="32"/>
+    <w:bookmarkStart w:id="33" w:name="protocol-deviation-detection"/>
     <w:p>
       <w:pPr>
         <w:pStyle w:val="Heading3"/>
@@ -2824,8 +2846,8 @@
         <w:t xml:space="preserve">Distinguishes: minor deviations (no patient safety impact) vs. major deviations (may require CRO notification)</w:t>
       </w:r>
     </w:p>
-    <w:bookmarkEnd w:id="32"/>
-    <w:bookmarkStart w:id="33" w:name="coordinator-performance-intelligence"/>
+    <w:bookmarkEnd w:id="33"/>
+    <w:bookmarkStart w:id="34" w:name="coordinator-performance-intelligence"/>
     <w:p>
       <w:pPr>
         <w:pStyle w:val="Heading3"/>
@@ -2907,9 +2929,9 @@
         </w:pict>
       </w:r>
     </w:p>
-    <w:bookmarkEnd w:id="33"/>
     <w:bookmarkEnd w:id="34"/>
-    <w:bookmarkStart w:id="38" w:name="patient-discovery-recruitment-engine"/>
+    <w:bookmarkEnd w:id="35"/>
+    <w:bookmarkStart w:id="39" w:name="patient-discovery-recruitment-engine"/>
     <w:p>
       <w:pPr>
         <w:pStyle w:val="Heading2"/>
@@ -2956,7 +2978,7 @@
         <w:t xml:space="preserve">What the platform provides:</w:t>
       </w:r>
     </w:p>
-    <w:bookmarkStart w:id="35" w:name="X98771f0d76df95560af9684b1f405ebba3a5f02"/>
+    <w:bookmarkStart w:id="36" w:name="X98771f0d76df95560af9684b1f405ebba3a5f02"/>
     <w:p>
       <w:pPr>
         <w:pStyle w:val="Heading3"/>
@@ -3001,8 +3023,8 @@
         <w:t xml:space="preserve">Priority queue: ranked by match score, qualification probability, and contact score</w:t>
       </w:r>
     </w:p>
-    <w:bookmarkEnd w:id="35"/>
-    <w:bookmarkStart w:id="36" w:name="Xbdbf387a95fe19c9b8f210fb6a7798512a4fa02"/>
+    <w:bookmarkEnd w:id="36"/>
+    <w:bookmarkStart w:id="37" w:name="Xbdbf387a95fe19c9b8f210fb6a7798512a4fa02"/>
     <w:p>
       <w:pPr>
         <w:pStyle w:val="Heading3"/>
@@ -3099,8 +3121,8 @@
         <w:t xml:space="preserve">Track campaign leads from Facebook/Google health ads; integrate with CRM for follow-through</w:t>
       </w:r>
     </w:p>
-    <w:bookmarkEnd w:id="36"/>
-    <w:bookmarkStart w:id="37" w:name="recruitment-pipeline-management"/>
+    <w:bookmarkEnd w:id="37"/>
+    <w:bookmarkStart w:id="38" w:name="recruitment-pipeline-management"/>
     <w:p>
       <w:pPr>
         <w:pStyle w:val="Heading3"/>
@@ -3188,9 +3210,9 @@
         </w:pict>
       </w:r>
     </w:p>
-    <w:bookmarkEnd w:id="37"/>
     <w:bookmarkEnd w:id="38"/>
-    <w:bookmarkStart w:id="39" w:name="competitive-positioning"/>
+    <w:bookmarkEnd w:id="39"/>
+    <w:bookmarkStart w:id="40" w:name="competitive-positioning"/>
     <w:p>
       <w:pPr>
         <w:pStyle w:val="Heading2"/>
@@ -4331,8 +4353,8 @@
         </w:pict>
       </w:r>
     </w:p>
-    <w:bookmarkEnd w:id="39"/>
-    <w:bookmarkStart w:id="42" w:name="technology-architecture"/>
+    <w:bookmarkEnd w:id="40"/>
+    <w:bookmarkStart w:id="43" w:name="technology-architecture"/>
     <w:p>
       <w:pPr>
         <w:pStyle w:val="Heading2"/>
@@ -4341,7 +4363,7 @@
         <w:t xml:space="preserve">Technology Architecture</w:t>
       </w:r>
     </w:p>
-    <w:bookmarkStart w:id="40" w:name="core-stack"/>
+    <w:bookmarkStart w:id="41" w:name="core-stack"/>
     <w:p>
       <w:pPr>
         <w:pStyle w:val="Heading3"/>
@@ -4961,8 +4983,8 @@
         </w:tc>
       </w:tr>
     </w:tbl>
-    <w:bookmarkEnd w:id="40"/>
-    <w:bookmarkStart w:id="41" w:name="compliance-architecture"/>
+    <w:bookmarkEnd w:id="41"/>
+    <w:bookmarkStart w:id="42" w:name="compliance-architecture"/>
     <w:p>
       <w:pPr>
         <w:pStyle w:val="Heading3"/>
@@ -5137,9 +5159,9 @@
         </w:pict>
       </w:r>
     </w:p>
-    <w:bookmarkEnd w:id="41"/>
     <w:bookmarkEnd w:id="42"/>
-    <w:bookmarkStart w:id="46" w:name="development-roadmap"/>
+    <w:bookmarkEnd w:id="43"/>
+    <w:bookmarkStart w:id="47" w:name="development-roadmap"/>
     <w:p>
       <w:pPr>
         <w:pStyle w:val="Heading2"/>
@@ -5148,7 +5170,7 @@
         <w:t xml:space="preserve">Development Roadmap</w:t>
       </w:r>
     </w:p>
-    <w:bookmarkStart w:id="43" w:name="phase-1-solimed-months-19"/>
+    <w:bookmarkStart w:id="44" w:name="phase-1-solimed-months-19"/>
     <w:p>
       <w:pPr>
         <w:pStyle w:val="Heading3"/>
@@ -5195,8 +5217,8 @@
         <w:t xml:space="preserve">- Layer 5 foundations (Backlog quality, cash flow prediction, basic dropout risk)</w:t>
       </w:r>
     </w:p>
-    <w:bookmarkEnd w:id="43"/>
-    <w:bookmarkStart w:id="44" w:name="phase-2-second-site-months-1015"/>
+    <w:bookmarkEnd w:id="44"/>
+    <w:bookmarkStart w:id="45" w:name="phase-2-second-site-months-1015"/>
     <w:p>
       <w:pPr>
         <w:pStyle w:val="Heading3"/>
@@ -5243,8 +5265,8 @@
         <w:t xml:space="preserve">- Patient qualification engine (Layer 5) trained on Solimed’s historical data</w:t>
       </w:r>
     </w:p>
-    <w:bookmarkEnd w:id="44"/>
-    <w:bookmarkStart w:id="45" w:name="phase-3-market-launch-months-1524"/>
+    <w:bookmarkEnd w:id="45"/>
+    <w:bookmarkStart w:id="46" w:name="phase-3-market-launch-months-1524"/>
     <w:p>
       <w:pPr>
         <w:pStyle w:val="Heading3"/>
@@ -5310,9 +5332,9 @@
         </w:pict>
       </w:r>
     </w:p>
-    <w:bookmarkEnd w:id="45"/>
     <w:bookmarkEnd w:id="46"/>
-    <w:bookmarkStart w:id="47" w:name="business-model"/>
+    <w:bookmarkEnd w:id="47"/>
+    <w:bookmarkStart w:id="48" w:name="business-model"/>
     <w:p>
       <w:pPr>
         <w:pStyle w:val="Heading2"/>
@@ -5631,340 +5653,34 @@
         </w:pict>
       </w:r>
     </w:p>
-    <w:bookmarkEnd w:id="47"/>
-    <w:bookmarkStart w:id="48" w:name="platform-name-options"/>
+    <w:bookmarkEnd w:id="48"/>
+    <w:bookmarkStart w:id="49" w:name="platform-name"/>
     <w:p>
       <w:pPr>
         <w:pStyle w:val="Heading2"/>
       </w:pPr>
       <w:r>
-        <w:t xml:space="preserve">Platform Name — Options</w:t>
-      </w:r>
-    </w:p>
-    <w:tbl>
-      <w:tblPr>
-        <w:tblStyle w:val="Table"/>
-        <w:tblW w:type="pct" w:w="5000"/>
-        <w:tblLayout w:type="fixed"/>
-        <w:tblLook w:firstRow="1" w:lastRow="0" w:firstColumn="0" w:lastColumn="0" w:noHBand="0" w:noVBand="0" w:val="0020"/>
-      </w:tblPr>
-      <w:tblGrid>
-        <w:gridCol w:w="2640"/>
-        <w:gridCol w:w="2640"/>
-        <w:gridCol w:w="2640"/>
-      </w:tblGrid>
-      <w:tr>
-        <w:trPr>
-          <w:tblHeader w:val="on"/>
-        </w:trPr>
-        <w:tc>
-          <w:tcPr/>
-          <w:p>
-            <w:pPr>
-              <w:pStyle w:val="Compact"/>
-            </w:pPr>
-            <w:r>
-              <w:t xml:space="preserve">Name</w:t>
-            </w:r>
-          </w:p>
-        </w:tc>
-        <w:tc>
-          <w:tcPr/>
-          <w:p>
-            <w:pPr>
-              <w:pStyle w:val="Compact"/>
-            </w:pPr>
-            <w:r>
-              <w:t xml:space="preserve">Meaning</w:t>
-            </w:r>
-          </w:p>
-        </w:tc>
-        <w:tc>
-          <w:tcPr/>
-          <w:p>
-            <w:pPr>
-              <w:pStyle w:val="Compact"/>
-            </w:pPr>
-            <w:r>
-              <w:t xml:space="preserve">Domain likely available?</w:t>
-            </w:r>
-          </w:p>
-        </w:tc>
-      </w:tr>
-      <w:tr>
-        <w:tc>
-          <w:tcPr/>
-          <w:p>
-            <w:pPr>
-              <w:pStyle w:val="Compact"/>
-            </w:pPr>
-            <w:r>
-              <w:rPr>
-                <w:b/>
-                <w:bCs/>
-              </w:rPr>
-              <w:t xml:space="preserve">Meridian</w:t>
-            </w:r>
-          </w:p>
-        </w:tc>
-        <w:tc>
-          <w:tcPr/>
-          <w:p>
-            <w:pPr>
-              <w:pStyle w:val="Compact"/>
-            </w:pPr>
-            <w:r>
-              <w:t xml:space="preserve">Navigation reference point — finding the exact position of a patient in their clinical journey</w:t>
-            </w:r>
-          </w:p>
-        </w:tc>
-        <w:tc>
-          <w:tcPr/>
-          <w:p>
-            <w:pPr>
-              <w:pStyle w:val="Compact"/>
-            </w:pPr>
-            <w:r>
-              <w:t xml:space="preserve">Likely</w:t>
-            </w:r>
-          </w:p>
-        </w:tc>
-      </w:tr>
-      <w:tr>
-        <w:tc>
-          <w:tcPr/>
-          <w:p>
-            <w:pPr>
-              <w:pStyle w:val="Compact"/>
-            </w:pPr>
-            <w:r>
-              <w:rPr>
-                <w:b/>
-                <w:bCs/>
-              </w:rPr>
-              <w:t xml:space="preserve">Helix</w:t>
-            </w:r>
-          </w:p>
-        </w:tc>
-        <w:tc>
-          <w:tcPr/>
-          <w:p>
-            <w:pPr>
-              <w:pStyle w:val="Compact"/>
-            </w:pPr>
-            <w:r>
-              <w:t xml:space="preserve">DNA double helix — clinical/life sciences reference</w:t>
-            </w:r>
-          </w:p>
-        </w:tc>
-        <w:tc>
-          <w:tcPr/>
-          <w:p>
-            <w:pPr>
-              <w:pStyle w:val="Compact"/>
-            </w:pPr>
-            <w:r>
-              <w:t xml:space="preserve">Unlikely (taken)</w:t>
-            </w:r>
-          </w:p>
-        </w:tc>
-      </w:tr>
-      <w:tr>
-        <w:tc>
-          <w:tcPr/>
-          <w:p>
-            <w:pPr>
-              <w:pStyle w:val="Compact"/>
-            </w:pPr>
-            <w:r>
-              <w:rPr>
-                <w:b/>
-                <w:bCs/>
-              </w:rPr>
-              <w:t xml:space="preserve">Nexus</w:t>
-            </w:r>
-          </w:p>
-        </w:tc>
-        <w:tc>
-          <w:tcPr/>
-          <w:p>
-            <w:pPr>
-              <w:pStyle w:val="Compact"/>
-            </w:pPr>
-            <w:r>
-              <w:t xml:space="preserve">Connection point — where all data sources connect</w:t>
-            </w:r>
-          </w:p>
-        </w:tc>
-        <w:tc>
-          <w:tcPr/>
-          <w:p>
-            <w:pPr>
-              <w:pStyle w:val="Compact"/>
-            </w:pPr>
-            <w:r>
-              <w:t xml:space="preserve">Unlikely</w:t>
-            </w:r>
-          </w:p>
-        </w:tc>
-      </w:tr>
-      <w:tr>
-        <w:tc>
-          <w:tcPr/>
-          <w:p>
-            <w:pPr>
-              <w:pStyle w:val="Compact"/>
-            </w:pPr>
-            <w:r>
-              <w:rPr>
-                <w:b/>
-                <w:bCs/>
-              </w:rPr>
-              <w:t xml:space="preserve">Canopy</w:t>
-            </w:r>
-          </w:p>
-        </w:tc>
-        <w:tc>
-          <w:tcPr/>
-          <w:p>
-            <w:pPr>
-              <w:pStyle w:val="Compact"/>
-            </w:pPr>
-            <w:r>
-              <w:t xml:space="preserve">Protection and coverage — covering the full trial journey</w:t>
-            </w:r>
-          </w:p>
-        </w:tc>
-        <w:tc>
-          <w:tcPr/>
-          <w:p>
-            <w:pPr>
-              <w:pStyle w:val="Compact"/>
-            </w:pPr>
-            <w:r>
-              <w:t xml:space="preserve">Possible</w:t>
-            </w:r>
-          </w:p>
-        </w:tc>
-      </w:tr>
-      <w:tr>
-        <w:tc>
-          <w:tcPr/>
-          <w:p>
-            <w:pPr>
-              <w:pStyle w:val="Compact"/>
-            </w:pPr>
-            <w:r>
-              <w:rPr>
-                <w:b/>
-                <w:bCs/>
-              </w:rPr>
-              <w:t xml:space="preserve">Cadence</w:t>
-            </w:r>
-          </w:p>
-        </w:tc>
-        <w:tc>
-          <w:tcPr/>
-          <w:p>
-            <w:pPr>
-              <w:pStyle w:val="Compact"/>
-            </w:pPr>
-            <w:r>
-              <w:t xml:space="preserve">Rhythm — the rhythm of clinical visits, payments, and protocols</w:t>
-            </w:r>
-          </w:p>
-        </w:tc>
-        <w:tc>
-          <w:tcPr/>
-          <w:p>
-            <w:pPr>
-              <w:pStyle w:val="Compact"/>
-            </w:pPr>
-            <w:r>
-              <w:t xml:space="preserve">Possible</w:t>
-            </w:r>
-          </w:p>
-        </w:tc>
-      </w:tr>
-      <w:tr>
-        <w:tc>
-          <w:tcPr/>
-          <w:p>
-            <w:pPr>
-              <w:pStyle w:val="Compact"/>
-            </w:pPr>
-            <w:r>
-              <w:rPr>
-                <w:b/>
-                <w:bCs/>
-              </w:rPr>
-              <w:t xml:space="preserve">Lumen</w:t>
-            </w:r>
-          </w:p>
-        </w:tc>
-        <w:tc>
-          <w:tcPr/>
-          <w:p>
-            <w:pPr>
-              <w:pStyle w:val="Compact"/>
-            </w:pPr>
-            <w:r>
-              <w:t xml:space="preserve">Unit of light — illuminating the patient journey</w:t>
-            </w:r>
-          </w:p>
-        </w:tc>
-        <w:tc>
-          <w:tcPr/>
-          <w:p>
-            <w:pPr>
-              <w:pStyle w:val="Compact"/>
-            </w:pPr>
-            <w:r>
-              <w:t xml:space="preserve">Possible</w:t>
-            </w:r>
-          </w:p>
-        </w:tc>
-      </w:tr>
-      <w:tr>
-        <w:tc>
-          <w:tcPr/>
-          <w:p>
-            <w:pPr>
-              <w:pStyle w:val="Compact"/>
-            </w:pPr>
-            <w:r>
-              <w:rPr>
-                <w:b/>
-                <w:bCs/>
-              </w:rPr>
-              <w:t xml:space="preserve">Stratum</w:t>
-            </w:r>
-          </w:p>
-        </w:tc>
-        <w:tc>
-          <w:tcPr/>
-          <w:p>
-            <w:pPr>
-              <w:pStyle w:val="Compact"/>
-            </w:pPr>
-            <w:r>
-              <w:t xml:space="preserve">Layers — the layered platform architecture</w:t>
-            </w:r>
-          </w:p>
-        </w:tc>
-        <w:tc>
-          <w:tcPr/>
-          <w:p>
-            <w:pPr>
-              <w:pStyle w:val="Compact"/>
-            </w:pPr>
-            <w:r>
-              <w:t xml:space="preserve">Possible</w:t>
-            </w:r>
-          </w:p>
-        </w:tc>
-      </w:tr>
-    </w:tbl>
+        <w:t xml:space="preserve">Platform Name</w:t>
+      </w:r>
+    </w:p>
+    <w:p>
+      <w:pPr>
+        <w:pStyle w:val="FirstParagraph"/>
+      </w:pPr>
+      <w:r>
+        <w:rPr>
+          <w:b/>
+          <w:bCs/>
+        </w:rPr>
+        <w:t xml:space="preserve">Meridian</w:t>
+      </w:r>
+      <w:r>
+        <w:t xml:space="preserve"> </w:t>
+      </w:r>
+      <w:r>
+        <w:t xml:space="preserve">— the reference line from which all position is measured. In clinical trials: where every patient is in their journey, where every dollar is in its lifecycle, where the next best candidate is in your data. Navigation. Precision. Clarity.</w:t>
+      </w:r>
+    </w:p>
     <w:p>
       <w:r>
         <w:pict>
@@ -5972,8 +5688,8 @@
         </w:pict>
       </w:r>
     </w:p>
-    <w:bookmarkEnd w:id="48"/>
-    <w:bookmarkStart w:id="49" w:name="relationship-to-solimed-engagement"/>
+    <w:bookmarkEnd w:id="49"/>
+    <w:bookmarkStart w:id="50" w:name="relationship-to-solimed-engagement"/>
     <w:p>
       <w:pPr>
         <w:pStyle w:val="Heading2"/>
@@ -6127,8 +5843,8 @@
         <w:t xml:space="preserve">This is a living vision document. It will be updated as Solimed’s Sprint 1 knowledge transfer and market research refines the feature priorities.</w:t>
       </w:r>
     </w:p>
-    <w:bookmarkEnd w:id="49"/>
     <w:bookmarkEnd w:id="50"/>
+    <w:bookmarkEnd w:id="51"/>
     <w:sectPr>
       <w:footnotePr>
         <w:numRestart w:val="eachSect"/>

</xml_diff>